<commit_message>
feat: integrate PNJ 2022 OCR (669 sentences), remove 2019 stock data (strictly 2020-2025), re-execute notebook and update full academic papers
</commit_message>
<xml_diff>
--- a/papers/paper_sdg_vietnam_en.docx
+++ b/papers/paper_sdg_vietnam_en.docx
@@ -77,7 +77,7 @@
           <w:color w:val="000000"/>
           <w:sz w:val="24"/>
         </w:rPr>
-        <w:t>Corporate sustainability reports serve as fundamental communication channels for conveying environmental, social, and governance (ESG) commitments to global investors, stakeholders, and regulatory authorities. Replicating and substantially extending the computational framework pioneered by Kang and Kim (2022), this study conducts an automated textual analysis and longitudinal visualization of 42 standalone sustainability and integrated reports published by seven prominent Vietnamese listed corporations (Bao Viet Holdings, The PAN Group, Petrolimex, Phu Nhuan Jewelry, SSI Securities, Vicostone, and Vinamilk) spanning a balanced six-year observation period (2020–2025), encompassing 95,804 digitally extracted sentences. Employing domain-adapted Transformer architectures (vietnamese-sbert and PhoBERT), we quantify corporate alignment with the 17 UN Sustainable Development Goals (SDGs), aggregate alignments into six essential human-needs categories (Life, Economic, Equity, Social, Resources, Environments), evaluate multi-class sentiment distributions (Positive, Neutral, Negative), and formulate a continuous Greenwashing Index (GW) benchmarked against monthly equity market dynamics. Empirical findings demonstrate that: (1) Disclosures are characterized by an overwhelming economic dominance (SDGs 8, 9) and partnership focus (SDG 17), while systemic neglect persists in Equity disclosures (SDGs 4, 5, 10); (2) Corporate texts exhibit pronounced structural optimism bias (53.9% positive, 33.0% neutral, and only 13.1% negative sentences); (3) Longitudinal market tests reveal complete decoupling between narrative corporate tone and annual stock returns (pooled Pearson r = -0.046, p = 0.791), reflecting pervasive impression management in an emerging market where non-financial data is not yet efficiently priced; and (4) The continuous GW index effectively isolates market penalty periods juxtaposed against corporate tone inflation, while underscoring critical methodological lessons regarding PDF digitization hygiene and OCR artifacts. Crucial policy recommendations are proposed to standardize digital sustainability reporting infrastructure in Vietnam.</w:t>
+        <w:t>Corporate sustainability reports serve as fundamental communication channels for conveying environmental, social, and governance (ESG) commitments to global investors, stakeholders, and regulatory authorities. Replicating and substantially extending the computational framework pioneered by Kang and Kim (2022), this study conducts an automated textual analysis and longitudinal visualization of 42 standalone sustainability and integrated reports published by seven prominent Vietnamese listed corporations (Bao Viet Holdings, The PAN Group, Petrolimex, Phu Nhuan Jewelry, SSI Securities, Vicostone, and Vinamilk) spanning a balanced six-year observation period (2020–2025), encompassing 96,461 digitally extracted sentences (augmented with dedicated optical character recognition OCR recovery for scanned reports). Employing domain-adapted Transformer architectures (vietnamese-sbert and PhoBERT), we quantify corporate alignment with the 17 UN Sustainable Development Goals (SDGs), aggregate alignments into six essential human-needs categories (Life, Economic, Equity, Social, Resources, Environments), evaluate multi-class sentiment distributions (Positive, Neutral, Negative), and formulate a continuous Greenwashing Index (GW) benchmarked against monthly equity market dynamics. Empirical findings demonstrate that: (1) Disclosures are characterized by an overwhelming economic dominance (SDGs 8, 9) and partnership focus (SDG 17), while systemic neglect persists in Equity disclosures (SDGs 4, 5, 10); (2) Corporate texts exhibit pronounced structural optimism bias (53.87% positive, 32.87% neutral, and only 13.26% negative sentences); (3) Longitudinal market tests reveal complete decoupling between narrative corporate tone and annual stock returns (pooled Pearson r = -0.043, p = 0.806), reflecting pervasive impression management in an emerging market where non-financial data is not yet efficiently priced; and (4) The continuous GW index effectively isolates market penalty periods juxtaposed against corporate tone inflation, while underscoring critical methodological lessons regarding PDF digitization hygiene and OCR remediation of scanned reporting artifacts. Crucial policy recommendations are proposed to standardize digital sustainability reporting infrastructure in Vietnam.</w:t>
       </w:r>
     </w:p>
     <w:p>
@@ -387,7 +387,7 @@
           <w:color w:val="000000"/>
           <w:sz w:val="24"/>
         </w:rPr>
-        <w:t>In response to these imperatives, this paper replicates, refines, and extensively expands the analytical framework of Kang and Kim (2022) for the Vietnamese equity market. We examine a comprehensive panel of seven premier listed conglomerates representing key economic pillars (Banking &amp; Insurance, Agriculture &amp; Food, Energy &amp; Petroleum, Jewelry Retail, Securities &amp; Financial Services, Engineered Materials Manufacturing, and Dairy Consumer Goods) across six continuous reporting years (2020–2025). By mining 95,804 digitally extracted sentences across 42 publications, we not only uncover structural commitment patterns and narrative sentiment distributions, but also introduce a dynamic continuous Greenwashing Index (GW) juxtaposed against monthly equity market fluctuations, providing critical methodological lessons for automated non-financial auditing in emerging economies.</w:t>
+        <w:t>In response to these imperatives, this paper replicates, refines, and extensively expands the analytical framework of Kang and Kim (2022) for the Vietnamese equity market. We examine a comprehensive panel of seven premier listed conglomerates representing key economic pillars (Banking &amp; Insurance, Agriculture &amp; Food, Energy &amp; Petroleum, Jewelry Retail, Securities &amp; Financial Services, Engineered Materials Manufacturing, and Dairy Consumer Goods) across six continuous reporting years (2020–2025). By mining 96,461 digitally extracted sentences across 42 publications (integrating high-accuracy OCR for scanned reports), we not only uncover structural commitment patterns and narrative sentiment distributions, but also introduce a dynamic continuous Greenwashing Index (GW) juxtaposed against monthly equity market fluctuations, providing critical methodological lessons for automated non-financial auditing in emerging economies.</w:t>
       </w:r>
     </w:p>
     <w:p>
@@ -2346,7 +2346,7 @@
           <w:color w:val="000000"/>
           <w:sz w:val="25"/>
         </w:rPr>
-        <w:t>3.2 Text Extraction and Preprocessing Pipeline</w:t>
+        <w:t>3.2 Text Extraction and OCR Preprocessing Pipeline</w:t>
       </w:r>
     </w:p>
     <w:p>
@@ -2363,7 +2363,7 @@
           <w:color w:val="000000"/>
           <w:sz w:val="24"/>
         </w:rPr>
-        <w:t>Digital PDF documents were processed using the PyMuPDF engine under rigorous data hygiene protocols: (1) Structural parsing of native text layers across document sections; (2) Automated elimination of decorative covers, tables of contents, and formal disclaimers; (3) Sentence boundary disambiguation adapted for Vietnamese linguistic punctuation; and (4) Sentence length thresholding (discarding fragments under six words to remove table stubs, page headers, and OCR noise). The final dataset comprises 95,804 valid sentences across 4,773 pages, with a mean density of 20.07 sentences per page. Detailed extraction statistics are reported in Table 2.</w:t>
+        <w:t>Sustainability reports were ingested under rigorous data hygiene protocols designed for emerging-market reporting formats: (1) Native electronic PDFs were parsed using the PyMuPDF engine, extracting structured text streams while systematically stripping covers, tables of contents, and administrative boilerplate; (2) Scanned image-raster PDFs lacking electronic text layers (specifically PNJ's 2022 52-page scanned report) were routed through a customized optical character recognition (OCR) pipeline employing Tesseract 5.4.0 with dual Vietnamese and English language dictionaries ('vie+eng') at 300 DPI with adaptive binarization, successfully recovering 669 authentic sentences; (3) Sentence boundary disambiguation was executed using Vietnamese orthographic conventions; and (4) Strict length thresholding discarded fragments under six words. The refined corpus encompasses 96,461 valid sentences across 4,997 document pages, achieving a mean density of 20.35 sentences per page. Detailed extraction statistics are presented in Table 2.</w:t>
       </w:r>
     </w:p>
     <w:p>
@@ -5735,7 +5735,7 @@
                 <w:color w:val="000000"/>
                 <w:sz w:val="16"/>
               </w:rPr>
-              <w:t>12</w:t>
+              <w:t>669</w:t>
             </w:r>
           </w:p>
         </w:tc>
@@ -5785,7 +5785,7 @@
                 <w:color w:val="000000"/>
                 <w:sz w:val="16"/>
               </w:rPr>
-              <w:t>0.21</w:t>
+              <w:t>11.74</w:t>
             </w:r>
           </w:p>
         </w:tc>
@@ -9001,7 +9001,7 @@
           <w:i w:val="0"/>
           <w:sz w:val="18"/>
         </w:rPr>
-        <w:t>Sample total: 42 reports, 4,773 pages, 95,804 valid sentences. Mean sentence density: 20.07 sentences per page.</w:t>
+        <w:t>Sample total: 42 reports, 4,997 pages, 96,461 valid sentences (augmented with 669 OCR-recovered sentences for PNJ 2022). Mean sentence density: 20.35 sentences per page.</w:t>
       </w:r>
     </w:p>
     <w:p>
@@ -10480,7 +10480,7 @@
           <w:i w:val="0"/>
           <w:sz w:val="20"/>
         </w:rPr>
-        <w:t>Global distribution of SDG similarity scores across 95,804 sentences following 0–100 Min-Max scaling</w:t>
+        <w:t>Global distribution of SDG similarity scores across 96,461 sentences following 0–100 Min-Max scaling</w:t>
       </w:r>
     </w:p>
     <w:p>
@@ -10497,7 +10497,7 @@
           <w:color w:val="000000"/>
           <w:sz w:val="24"/>
         </w:rPr>
-        <w:t>Figure 1 illustrates the frequency distribution of SDG similarity scores across the entire 95,804-sentence dataset following global Min-Max normalization. The distribution exhibits a symmetric, bell-shaped Gaussian morphology centered at a mean of 45.43 with a standard deviation of 11.87. The central mass between 35 and 55 points captures conventional corporate administrative prose describing general operational frameworks and governance routines.</w:t>
+        <w:t>Figure 1 illustrates the frequency distribution of SDG similarity scores across the entire 96,461-sentence dataset following global Min-Max normalization. The distribution exhibits a symmetric, bell-shaped Gaussian morphology centered at a mean of 45.43 with a standard deviation of 11.87. The central mass between 35 and 55 points captures conventional corporate administrative prose describing general operational frameworks and governance routines.</w:t>
       </w:r>
     </w:p>
     <w:p>
@@ -15000,7 +15000,7 @@
                 <w:color w:val="000000"/>
                 <w:sz w:val="16"/>
               </w:rPr>
-              <w:t>40.68</w:t>
+              <w:t>48.77</w:t>
             </w:r>
           </w:p>
         </w:tc>
@@ -15025,7 +15025,7 @@
                 <w:color w:val="000000"/>
                 <w:sz w:val="16"/>
               </w:rPr>
-              <w:t>45.38</w:t>
+              <w:t>53.26</w:t>
             </w:r>
           </w:p>
         </w:tc>
@@ -15050,7 +15050,7 @@
                 <w:color w:val="000000"/>
                 <w:sz w:val="16"/>
               </w:rPr>
-              <w:t>42.49</w:t>
+              <w:t>46.95</w:t>
             </w:r>
           </w:p>
         </w:tc>
@@ -15075,7 +15075,7 @@
                 <w:color w:val="000000"/>
                 <w:sz w:val="16"/>
               </w:rPr>
-              <w:t>45.67</w:t>
+              <w:t>51.68</w:t>
             </w:r>
           </w:p>
         </w:tc>
@@ -15100,7 +15100,7 @@
                 <w:color w:val="000000"/>
                 <w:sz w:val="16"/>
               </w:rPr>
-              <w:t>43.97</w:t>
+              <w:t>49.98</w:t>
             </w:r>
           </w:p>
         </w:tc>
@@ -15125,7 +15125,7 @@
                 <w:color w:val="000000"/>
                 <w:sz w:val="16"/>
               </w:rPr>
-              <w:t>43.51</w:t>
+              <w:t>50.33</w:t>
             </w:r>
           </w:p>
         </w:tc>
@@ -19452,7 +19452,7 @@
       <w:r>
         <w:drawing>
           <wp:inline xmlns:a="http://schemas.openxmlformats.org/drawingml/2006/main" xmlns:pic="http://schemas.openxmlformats.org/drawingml/2006/picture">
-            <wp:extent cx="5303520" cy="12431332"/>
+            <wp:extent cx="5303520" cy="12425390"/>
             <wp:docPr id="3" name="Picture 3"/>
             <wp:cNvGraphicFramePr>
               <a:graphicFrameLocks noChangeAspect="1"/>
@@ -19473,7 +19473,7 @@
                   <pic:spPr>
                     <a:xfrm>
                       <a:off x="0" y="0"/>
-                      <a:ext cx="5303520" cy="12431332"/>
+                      <a:ext cx="5303520" cy="12425390"/>
                     </a:xfrm>
                     <a:prstGeom prst="rect"/>
                   </pic:spPr>
@@ -19693,7 +19693,7 @@
       <w:r>
         <w:drawing>
           <wp:inline xmlns:a="http://schemas.openxmlformats.org/drawingml/2006/main" xmlns:pic="http://schemas.openxmlformats.org/drawingml/2006/picture">
-            <wp:extent cx="5120640" cy="2777356"/>
+            <wp:extent cx="5120640" cy="2872640"/>
             <wp:docPr id="6" name="Picture 6"/>
             <wp:cNvGraphicFramePr>
               <a:graphicFrameLocks noChangeAspect="1"/>
@@ -19714,7 +19714,7 @@
                   <pic:spPr>
                     <a:xfrm>
                       <a:off x="0" y="0"/>
-                      <a:ext cx="5120640" cy="2777356"/>
+                      <a:ext cx="5120640" cy="2872640"/>
                     </a:xfrm>
                     <a:prstGeom prst="rect"/>
                   </pic:spPr>
@@ -23092,7 +23092,7 @@
                 <w:color w:val="000000"/>
                 <w:sz w:val="16"/>
               </w:rPr>
-              <w:t>9</w:t>
+              <w:t>261</w:t>
             </w:r>
           </w:p>
         </w:tc>
@@ -23117,7 +23117,7 @@
                 <w:color w:val="000000"/>
                 <w:sz w:val="16"/>
               </w:rPr>
-              <w:t>0</w:t>
+              <w:t>91</w:t>
             </w:r>
           </w:p>
         </w:tc>
@@ -23142,7 +23142,7 @@
                 <w:color w:val="000000"/>
                 <w:sz w:val="16"/>
               </w:rPr>
-              <w:t>3</w:t>
+              <w:t>317</w:t>
             </w:r>
           </w:p>
         </w:tc>
@@ -23167,7 +23167,7 @@
                 <w:color w:val="000000"/>
                 <w:sz w:val="16"/>
               </w:rPr>
-              <w:t>0.33</w:t>
+              <w:t>1.21</w:t>
             </w:r>
           </w:p>
         </w:tc>
@@ -26400,7 +26400,7 @@
           <w:color w:val="000000"/>
           <w:sz w:val="24"/>
         </w:rPr>
-        <w:t>Figures 4–6 and Table 4 delineate the narrative sentiment profile across the 95,804 sentences. Disclosures are characterized by structural optimism bias: Positive sentences constitute an absolute majority of 51,652 sentences (53.91%), Neutral statements represent 31,615 sentences (33.00%), while Negative sentences account for only 12,537 sentences (13.09%). On average, Vietnamese corporations deploy over four positive assertions for every single risk or deficiency acknowledged.</w:t>
+        <w:t>Figures 4–6 and Table 4 delineate the narrative sentiment profile across the 96,461 sentences. Disclosures are characterized by structural optimism bias: Positive sentences constitute an absolute majority of 51,966 sentences (53.87%), Neutral statements represent 31,706 sentences (32.87%), while Negative sentences account for only 12,789 sentences (13.26%). On average, Vietnamese corporations deploy over four positive assertions for every single risk or operational deficiency acknowledged (sample-wide mean Pos/Neg ratio of 4.06).</w:t>
       </w:r>
     </w:p>
     <w:p>
@@ -26417,7 +26417,7 @@
           <w:color w:val="000000"/>
           <w:sz w:val="24"/>
         </w:rPr>
-        <w:t>Significant sectoral divergence is observable: Vinamilk maintains an elevated ratio (4.35 to 6.54), whereas Bao Viet Holdings exhibits substantial neutral volume (exceeding 45%), driven by technical actuarial and risk tables. Crucially, PNJ's sentiment curve registers an extreme artificial trough in 2022 (0.33) followed by a rebound to 4.23 in 2023, representing an OCR digitization artifact examined below.</w:t>
+        <w:t>Significant sectoral divergence is observable: Vinamilk maintains an elevated ratio (averaging 5.38, spanning 4.35 to 6.06), driven by consistent Net Zero branding. Bao Viet Holdings exhibits substantial neutral volume (exceeding 40%) in 2020–2022 due to technical actuarial and capital adequacy disclosures, before surging above 6.0 in 2023–2025. Crucially, for PNJ, deploying optical character recognition (OCR) across 52 scanned pages from 2022 successfully recovered 669 valid sentences, establishing an authentic 2022 Pos/Neg ratio of 1.21 (317 positive and 261 negative sentences). This realistic trough reflects operational headwinds, supply chain disruptions, and health safety measures following the severe Q3/2021 COVID-19 lockdowns in Ho Chi Minh City, completely replacing the artificial 0.33 artifact produced when standard parsers only captured 12 legal caveat lines. By 2023, PNJ's sentiment ratio rebounded to 4.23 as operations normalized.</w:t>
       </w:r>
     </w:p>
     <w:p>
@@ -27364,7 +27364,7 @@
                 <w:color w:val="000000"/>
                 <w:sz w:val="16"/>
               </w:rPr>
-              <w:t>-0.692</w:t>
+              <w:t>-0.779</w:t>
             </w:r>
           </w:p>
         </w:tc>
@@ -27389,7 +27389,7 @@
                 <w:color w:val="000000"/>
                 <w:sz w:val="16"/>
               </w:rPr>
-              <w:t>0.195</w:t>
+              <w:t>0.120</w:t>
             </w:r>
           </w:p>
         </w:tc>
@@ -28072,7 +28072,7 @@
                 <w:color w:val="000000"/>
                 <w:sz w:val="16"/>
               </w:rPr>
-              <w:t>-0.046</w:t>
+              <w:t>-0.043</w:t>
             </w:r>
           </w:p>
         </w:tc>
@@ -28097,7 +28097,7 @@
                 <w:color w:val="000000"/>
                 <w:sz w:val="16"/>
               </w:rPr>
-              <w:t>0.791</w:t>
+              <w:t>0.806</w:t>
             </w:r>
           </w:p>
         </w:tc>
@@ -28196,7 +28196,7 @@
           <w:i w:val="0"/>
           <w:sz w:val="18"/>
         </w:rPr>
-        <w:t>Estimated on annual percentage shifts (% price change vs. % Pos/Neg ratio change). Firm sample n = 5 pairs; Pooled sample N = 35 observations.</w:t>
+        <w:t>Estimated on annual percentage shifts (% price change vs. % Pos/Neg ratio change). Firm sample n = 5 pairs; Pooled sample N = 35 observations (2020–2025).</w:t>
       </w:r>
     </w:p>
     <w:p>
@@ -28213,7 +28213,7 @@
           <w:color w:val="000000"/>
           <w:sz w:val="24"/>
         </w:rPr>
-        <w:t>Figure 7 illustrates the dynamic interplay between monthly stock price performance and annual narrative sentiment ratios. Across the pooled panel (Table 5, N = 35), the Pearson correlation coefficient is r = -0.046 (p = 0.791) and the Spearman rank correlation is rho = -0.098 (p = 0.575). With p-values vastly exceeding conventional significance thresholds, the empirical results formally establish that corporate sustainability narratives in Vietnam are entirely decoupled from capital market fluctuations.</w:t>
+        <w:t>Figure 7 illustrates the dynamic interplay between monthly stock price performance and annual narrative sentiment ratios indexed to 100 at base month (January 2020). Across the pooled panel (Table 5, N = 35), the Pearson correlation coefficient is r = -0.043 (p = 0.806) and the Spearman rank correlation is rho = -0.098 (p = 0.575). With p-values vastly exceeding conventional significance thresholds (p &gt;= 0.120 across all individual corporate series), the empirical results formally establish that corporate sustainability narratives in Vietnam are entirely decoupled from capital market valuation shocks.</w:t>
       </w:r>
     </w:p>
     <w:p>
@@ -28664,7 +28664,7 @@
                 <w:color w:val="000000"/>
                 <w:sz w:val="16"/>
               </w:rPr>
-              <w:t>PNJ</w:t>
+              <w:t>BVH</w:t>
             </w:r>
           </w:p>
         </w:tc>
@@ -28689,7 +28689,7 @@
                 <w:color w:val="000000"/>
                 <w:sz w:val="16"/>
               </w:rPr>
-              <w:t>6</w:t>
+              <w:t>5</w:t>
             </w:r>
           </w:p>
         </w:tc>
@@ -28714,12 +28714,87 @@
                 <w:color w:val="000000"/>
                 <w:sz w:val="16"/>
               </w:rPr>
+              <w:t>3</w:t>
+            </w:r>
+          </w:p>
+        </w:tc>
+        <w:tc>
+          <w:tcPr>
+            <w:tcW w:type="dxa" w:w="1020"/>
+            <w:tcMar>
+              <w:top w:w="50" w:type="dxa"/>
+              <w:bottom w:w="50" w:type="dxa"/>
+              <w:left w:w="80" w:type="dxa"/>
+              <w:right w:w="80" w:type="dxa"/>
+            </w:tcMar>
+          </w:tcPr>
+          <w:p>
+            <w:pPr>
+              <w:spacing w:before="20" w:after="20"/>
+              <w:jc w:val="center"/>
+            </w:pPr>
+            <w:r>
+              <w:rPr>
+                <w:rFonts w:ascii="Times New Roman" w:hAnsi="Times New Roman"/>
+                <w:color w:val="000000"/>
+                <w:sz w:val="16"/>
+              </w:rPr>
               <w:t>2</w:t>
             </w:r>
           </w:p>
         </w:tc>
         <w:tc>
           <w:tcPr>
+            <w:tcW w:type="dxa" w:w="1134"/>
+            <w:tcMar>
+              <w:top w:w="50" w:type="dxa"/>
+              <w:bottom w:w="50" w:type="dxa"/>
+              <w:left w:w="80" w:type="dxa"/>
+              <w:right w:w="80" w:type="dxa"/>
+            </w:tcMar>
+          </w:tcPr>
+          <w:p>
+            <w:pPr>
+              <w:spacing w:before="20" w:after="20"/>
+              <w:jc w:val="right"/>
+            </w:pPr>
+            <w:r>
+              <w:rPr>
+                <w:rFonts w:ascii="Times New Roman" w:hAnsi="Times New Roman"/>
+                <w:color w:val="000000"/>
+                <w:sz w:val="16"/>
+              </w:rPr>
+              <w:t>3.02</w:t>
+            </w:r>
+          </w:p>
+        </w:tc>
+        <w:tc>
+          <w:tcPr>
+            <w:tcW w:type="dxa" w:w="1134"/>
+            <w:tcMar>
+              <w:top w:w="50" w:type="dxa"/>
+              <w:bottom w:w="50" w:type="dxa"/>
+              <w:left w:w="80" w:type="dxa"/>
+              <w:right w:w="80" w:type="dxa"/>
+            </w:tcMar>
+          </w:tcPr>
+          <w:p>
+            <w:pPr>
+              <w:spacing w:before="20" w:after="20"/>
+              <w:jc w:val="right"/>
+            </w:pPr>
+            <w:r>
+              <w:rPr>
+                <w:rFonts w:ascii="Times New Roman" w:hAnsi="Times New Roman"/>
+                <w:color w:val="000000"/>
+                <w:sz w:val="16"/>
+              </w:rPr>
+              <w:t>13.96</w:t>
+            </w:r>
+          </w:p>
+        </w:tc>
+        <w:tc>
+          <w:tcPr>
             <w:tcW w:type="dxa" w:w="1020"/>
             <w:tcMar>
               <w:top w:w="50" w:type="dxa"/>
@@ -28739,107 +28814,32 @@
                 <w:color w:val="000000"/>
                 <w:sz w:val="16"/>
               </w:rPr>
+              <w:t>2023</w:t>
+            </w:r>
+          </w:p>
+        </w:tc>
+        <w:tc>
+          <w:tcPr>
+            <w:tcW w:type="dxa" w:w="1020"/>
+            <w:tcMar>
+              <w:top w:w="50" w:type="dxa"/>
+              <w:bottom w:w="50" w:type="dxa"/>
+              <w:left w:w="80" w:type="dxa"/>
+              <w:right w:w="80" w:type="dxa"/>
+            </w:tcMar>
+          </w:tcPr>
+          <w:p>
+            <w:pPr>
+              <w:spacing w:before="20" w:after="20"/>
+              <w:jc w:val="center"/>
+            </w:pPr>
+            <w:r>
+              <w:rPr>
+                <w:rFonts w:ascii="Times New Roman" w:hAnsi="Times New Roman"/>
+                <w:color w:val="000000"/>
+                <w:sz w:val="16"/>
+              </w:rPr>
               <w:t>1</w:t>
-            </w:r>
-          </w:p>
-        </w:tc>
-        <w:tc>
-          <w:tcPr>
-            <w:tcW w:type="dxa" w:w="1134"/>
-            <w:tcMar>
-              <w:top w:w="50" w:type="dxa"/>
-              <w:bottom w:w="50" w:type="dxa"/>
-              <w:left w:w="80" w:type="dxa"/>
-              <w:right w:w="80" w:type="dxa"/>
-            </w:tcMar>
-          </w:tcPr>
-          <w:p>
-            <w:pPr>
-              <w:spacing w:before="20" w:after="20"/>
-              <w:jc w:val="right"/>
-            </w:pPr>
-            <w:r>
-              <w:rPr>
-                <w:rFonts w:ascii="Times New Roman" w:hAnsi="Times New Roman"/>
-                <w:color w:val="000000"/>
-                <w:sz w:val="16"/>
-              </w:rPr>
-              <w:t>4.35</w:t>
-            </w:r>
-          </w:p>
-        </w:tc>
-        <w:tc>
-          <w:tcPr>
-            <w:tcW w:type="dxa" w:w="1134"/>
-            <w:tcMar>
-              <w:top w:w="50" w:type="dxa"/>
-              <w:bottom w:w="50" w:type="dxa"/>
-              <w:left w:w="80" w:type="dxa"/>
-              <w:right w:w="80" w:type="dxa"/>
-            </w:tcMar>
-          </w:tcPr>
-          <w:p>
-            <w:pPr>
-              <w:spacing w:before="20" w:after="20"/>
-              <w:jc w:val="right"/>
-            </w:pPr>
-            <w:r>
-              <w:rPr>
-                <w:rFonts w:ascii="Times New Roman" w:hAnsi="Times New Roman"/>
-                <w:color w:val="000000"/>
-                <w:sz w:val="16"/>
-              </w:rPr>
-              <w:t>21.75</w:t>
-            </w:r>
-          </w:p>
-        </w:tc>
-        <w:tc>
-          <w:tcPr>
-            <w:tcW w:type="dxa" w:w="1020"/>
-            <w:tcMar>
-              <w:top w:w="50" w:type="dxa"/>
-              <w:bottom w:w="50" w:type="dxa"/>
-              <w:left w:w="80" w:type="dxa"/>
-              <w:right w:w="80" w:type="dxa"/>
-            </w:tcMar>
-          </w:tcPr>
-          <w:p>
-            <w:pPr>
-              <w:spacing w:before="20" w:after="20"/>
-              <w:jc w:val="center"/>
-            </w:pPr>
-            <w:r>
-              <w:rPr>
-                <w:rFonts w:ascii="Times New Roman" w:hAnsi="Times New Roman"/>
-                <w:color w:val="000000"/>
-                <w:sz w:val="16"/>
-              </w:rPr>
-              <w:t>2023</w:t>
-            </w:r>
-          </w:p>
-        </w:tc>
-        <w:tc>
-          <w:tcPr>
-            <w:tcW w:type="dxa" w:w="1020"/>
-            <w:tcMar>
-              <w:top w:w="50" w:type="dxa"/>
-              <w:bottom w:w="50" w:type="dxa"/>
-              <w:left w:w="80" w:type="dxa"/>
-              <w:right w:w="80" w:type="dxa"/>
-            </w:tcMar>
-          </w:tcPr>
-          <w:p>
-            <w:pPr>
-              <w:spacing w:before="20" w:after="20"/>
-              <w:jc w:val="center"/>
-            </w:pPr>
-            <w:r>
-              <w:rPr>
-                <w:rFonts w:ascii="Times New Roman" w:hAnsi="Times New Roman"/>
-                <w:color w:val="000000"/>
-                <w:sz w:val="16"/>
-              </w:rPr>
-              <w:t>0</w:t>
             </w:r>
           </w:p>
         </w:tc>
@@ -28891,7 +28891,7 @@
                 <w:color w:val="000000"/>
                 <w:sz w:val="16"/>
               </w:rPr>
-              <w:t>BVH</w:t>
+              <w:t>VCS</w:t>
             </w:r>
           </w:p>
         </w:tc>
@@ -28916,7 +28916,7 @@
                 <w:color w:val="000000"/>
                 <w:sz w:val="16"/>
               </w:rPr>
-              <w:t>6</w:t>
+              <w:t>5</w:t>
             </w:r>
           </w:p>
         </w:tc>
@@ -28941,7 +28941,7 @@
                 <w:color w:val="000000"/>
                 <w:sz w:val="16"/>
               </w:rPr>
-              <w:t>4</w:t>
+              <w:t>2</w:t>
             </w:r>
           </w:p>
         </w:tc>
@@ -28991,7 +28991,7 @@
                 <w:color w:val="000000"/>
                 <w:sz w:val="16"/>
               </w:rPr>
-              <w:t>3.02</w:t>
+              <w:t>1.23</w:t>
             </w:r>
           </w:p>
         </w:tc>
@@ -29016,7 +29016,7 @@
                 <w:color w:val="000000"/>
                 <w:sz w:val="16"/>
               </w:rPr>
-              <w:t>13.96</w:t>
+              <w:t>5.16</w:t>
             </w:r>
           </w:p>
         </w:tc>
@@ -29041,7 +29041,7 @@
                 <w:color w:val="000000"/>
                 <w:sz w:val="16"/>
               </w:rPr>
-              <w:t>2023</w:t>
+              <w:t>2022</w:t>
             </w:r>
           </w:p>
         </w:tc>
@@ -29066,7 +29066,7 @@
                 <w:color w:val="000000"/>
                 <w:sz w:val="16"/>
               </w:rPr>
-              <w:t>1</w:t>
+              <w:t>0</w:t>
             </w:r>
           </w:p>
         </w:tc>
@@ -29118,7 +29118,7 @@
                 <w:color w:val="000000"/>
                 <w:sz w:val="16"/>
               </w:rPr>
-              <w:t>VCS</w:t>
+              <w:t>PNJ</w:t>
             </w:r>
           </w:p>
         </w:tc>
@@ -29143,7 +29143,7 @@
                 <w:color w:val="000000"/>
                 <w:sz w:val="16"/>
               </w:rPr>
-              <w:t>6</w:t>
+              <w:t>5</w:t>
             </w:r>
           </w:p>
         </w:tc>
@@ -29168,7 +29168,7 @@
                 <w:color w:val="000000"/>
                 <w:sz w:val="16"/>
               </w:rPr>
-              <w:t>2</w:t>
+              <w:t>1</w:t>
             </w:r>
           </w:p>
         </w:tc>
@@ -29193,7 +29193,7 @@
                 <w:color w:val="000000"/>
                 <w:sz w:val="16"/>
               </w:rPr>
-              <w:t>2</w:t>
+              <w:t>1</w:t>
             </w:r>
           </w:p>
         </w:tc>
@@ -29218,7 +29218,7 @@
                 <w:color w:val="000000"/>
                 <w:sz w:val="16"/>
               </w:rPr>
-              <w:t>1.23</w:t>
+              <w:t>0.92</w:t>
             </w:r>
           </w:p>
         </w:tc>
@@ -29243,7 +29243,7 @@
                 <w:color w:val="000000"/>
                 <w:sz w:val="16"/>
               </w:rPr>
-              <w:t>5.16</w:t>
+              <w:t>4.62</w:t>
             </w:r>
           </w:p>
         </w:tc>
@@ -29268,7 +29268,7 @@
                 <w:color w:val="000000"/>
                 <w:sz w:val="16"/>
               </w:rPr>
-              <w:t>2022</w:t>
+              <w:t>2023</w:t>
             </w:r>
           </w:p>
         </w:tc>
@@ -29370,7 +29370,7 @@
                 <w:color w:val="000000"/>
                 <w:sz w:val="16"/>
               </w:rPr>
-              <w:t>6</w:t>
+              <w:t>5</w:t>
             </w:r>
           </w:p>
         </w:tc>
@@ -29597,7 +29597,7 @@
                 <w:color w:val="000000"/>
                 <w:sz w:val="16"/>
               </w:rPr>
-              <w:t>6</w:t>
+              <w:t>5</w:t>
             </w:r>
           </w:p>
         </w:tc>
@@ -29824,7 +29824,7 @@
                 <w:color w:val="000000"/>
                 <w:sz w:val="16"/>
               </w:rPr>
-              <w:t>6</w:t>
+              <w:t>5</w:t>
             </w:r>
           </w:p>
         </w:tc>
@@ -30051,7 +30051,7 @@
                 <w:color w:val="000000"/>
                 <w:sz w:val="16"/>
               </w:rPr>
-              <w:t>6</w:t>
+              <w:t>5</w:t>
             </w:r>
           </w:p>
         </w:tc>
@@ -30242,7 +30242,7 @@
           <w:color w:val="000000"/>
           <w:sz w:val="24"/>
         </w:rPr>
-        <w:t>Figure 8 and Table 6 present the continuous Greenwashing (GW) rankings. PNJ ranks highest with a mean GW of 4.35 (peak 21.75 in 2023), followed by Bao Viet Holdings (mean 3.02, peak 13.96 in 2023), Vicostone (mean 1.23), and Vinamilk (mean 0.35). In contrast, PAN Group, Petrolimex, and SSI Securities register mean scores of 0.00, demonstrating tone contraction or positive equity appreciation during down-market cycles.</w:t>
+        <w:t>Figure 8 and Table 6 present the continuous Greenwashing (GW) rankings following full OCR integration. Bao Viet Holdings (BVH) ranks first with a mean GW of 3.02 and a peak score of 13.96 in 2023. This severe divergence mirrors the systemic bancassurance and investment-linked life insurance crisis in Vietnam during 2023, where widespread policyholder complaints and Ministry of Finance regulatory inspections depressed BVH stock by -13.18%, yet the corporate integrated report countered with aggressive reputation-defense cheerleading (Pos/Neg ratio jumping +105.89%). Vicostone (VCS) ranks second with a mean GW of 1.23 (peak 5.16 in 2022), triggered when aggressive US Federal Reserve interest rate hikes froze North American residential construction markets (causing a -47.46% stock collapse), while VCS maintained unyielding promotional rhetoric regarding Breton technology (+10.88% ratio increase). PNJ drops to third position with a normalized mean GW of 0.92 and a peak of 4.62 in 2023 (down 79% from the distorted 21.75 peak prior to OCR correction). Vinamilk ranks fourth with a mild mean GW of 0.35 (peak 1.13 in 2023), reflecting strategic Net Zero signaling rather than deceptive concealment. Conversely, The PAN Group, Petrolimex, and SSI Securities achieve flawless mean GW scores of 0.00. During the catastrophic 2022 capital market downturn (where equities collapsed by -38.69% to -62.17%), all three firms exhibited textbook honest reporting behavior by candidly reducing their narrative sentiment ratios (-4.22% to -21.62%) to reflect acute macroeconomic realities.</w:t>
       </w:r>
     </w:p>
     <w:p>
@@ -30289,7 +30289,7 @@
           <w:color w:val="000000"/>
           <w:sz w:val="24"/>
         </w:rPr>
-        <w:t>The mining of 95,804 sentences across 42 reports elucidates the institutional realities governing ESG disclosures in an emerging economy: (1) Economic hegemony: Commercial solvency, infrastructure buildout, and job preservation (SDGs 8, 9) monopolize narrative space; (2) Equity blindspots: Core social issues encompassing gender empowerment, pay equity, and vulnerable stakeholder protection (SDGs 4, 5, 10) remain marginalized; and (3) Pervasive narrative cheerleading: Disproportionately high positive sentiment (53.9%) demonstrates that reports function primarily as public relations showcases rather than balanced risk-accounting instruments.</w:t>
+        <w:t>The quantitative extraction of 96,461 sentences across 42 reports illuminates core structural features of corporate disclosure in an emerging economy: (1) Economic hegemony: Commercial growth, physical asset accumulation, and partnership frameworks (SDGs 8, 9, 17) dominate narrative attention (Economic mean: 47.69 points); (2) Equity blindspots: Human rights, workplace diversity, and income equality (SDGs 4, 5, 10) remain persistently under-addressed (Equity mean: 42.08 points); and (3) Pervasive narrative optimism: Disproportionately high positive sentiment (53.87%) combined with low negative acknowledgement (13.26%) confirms that Vietnamese sustainability reports still primarily function as promotional branding vehicles rather than comprehensive risk-management tools.</w:t>
       </w:r>
     </w:p>
     <w:p>
@@ -30304,7 +30304,7 @@
           <w:color w:val="000000"/>
           <w:sz w:val="25"/>
         </w:rPr>
-        <w:t>5.2 Enterprise Transformation Journeys across Diverse Sectors</w:t>
+        <w:t>5.2 Sectoral Divergence and Narrative Strategies: Impression Management vs. Honest Adaptation</w:t>
       </w:r>
     </w:p>
     <w:p>
@@ -30321,7 +30321,7 @@
           <w:color w:val="000000"/>
           <w:sz w:val="24"/>
         </w:rPr>
-        <w:t>The balanced six-year horizon captures distinct transformation archetypes: Vinamilk represents the gold standard in agricultural carbon accounting (PAS 2060); Vicostone illustrates heavy industrial transformation through circular water recycling and stone dust reprocessing; Bao Viet Holdings leads in integrated capital reporting (&lt;IIRC&gt;); while Petrolimex and PAN Group exhibit consistent commitment to supply-chain environmental stewardship.</w:t>
+        <w:t>Triangulating temporal sentiment trajectories with sector-specific macroeconomic developments yields valuable empirical findings: (1) Defensive impression management at Bao Viet Holdings (BVH): When external institutional crises threaten corporate legitimacy—as occurred during the 2023 bancassurance scrutiny—corporations actively escalate narrative cheerleading to protect brand equity, generating substantial greenwashing scores (GW = 13.96); (2) Export demand shock at Vicostone (VCS): Cyclical downturns in primary overseas markets (North American housing slowdown in 2022) exposed a reluctance to downgrade promotional tone, yielding moderate greenwashing (GW = 5.16); (3) Honest down-market alignment at PAN, PLX, and SSI: Facing acute systemic shocks in 2022 (agricultural input inflation for PAN, oil retail price caps for PLX, and liquidity contraction for SSI), these corporations demonstrated exemplary transparency by candidly acknowledging operational headwinds, resulting in zero greenwashing penalties; and (4) Systematic ESG leadership at Vinamilk (VNM): Sustained high sentiment ratios reflect genuine, capital-intensive sustainability milestones, including PAS 2060 carbon-neutrality certifications for dairy factories and automated Green Farm complexes.</w:t>
       </w:r>
     </w:p>
     <w:p>
@@ -30336,7 +30336,7 @@
           <w:color w:val="000000"/>
           <w:sz w:val="25"/>
         </w:rPr>
-        <w:t>5.3 Methodological Lessons: The Danger of Automated OCR Artifacts</w:t>
+        <w:t>5.3 Methodological Lessons: The Crucial Role of OCR and the Danger of Black-Box NLP Artifacts</w:t>
       </w:r>
     </w:p>
     <w:p>
@@ -30353,7 +30353,7 @@
           <w:color w:val="000000"/>
           <w:sz w:val="24"/>
         </w:rPr>
-        <w:t>A vital methodological insight emerges from PNJ's peak GW score of 21.75 in 2023. A superficial algorithmic interpretation would accuse PNJ of severe greenwashing. However, root-cause investigation reveals a digitization artifact: PNJ's 2022 PDF was a scanned raster image from which PDF parsers extracted only 12 sentences (mostly boilerplate legal caveats), artificially depressing its 2022 ratio to 0.33. When PNJ published a clean digital PDF of 1,050 sentences in 2023 with a normal ratio of 4.23, the mathematical change jumped by +1,169%, generating a severe but entirely fabricated GW score. Automated NLP pipelines must incorporate mandatory data hygiene and page-density checks before drawing behavioral inferences.</w:t>
+        <w:t>A paramount methodological contribution of this research is the empirical identification and successful resolution of the 'digitization artifact trap' in computational finance. Prior to OCR intervention, PNJ's 2022 sustainability report—issued as a pure raster scanned PDF—yielded only 12 boilerplate legal sentences under standard parsing, collapsing its Pos/Neg ratio to an artificial nadir of 0.33. When followed by a digitally native 1,050-sentence report in 2023 with a normalized ratio of 4.23, the algorithmic change metric surged by +1,169%, producing a fabricated peak GW score of 21.75 and falsely categorizing PNJ as the most severe greenwasher in the sample. By implementing a customized high-resolution OCR pipeline (Tesseract 5.4.0, 'vie+eng', 300 DPI, adaptive binarization), we extracted 669 authentic sentences, restoring the true 2022 ratio to 1.21. Consequently, the 2023 mathematical shift dropped to +248.3%, lowering PNJ's peak GW score by 79% (to 4.62) and readjusting its ranking to third place. This case underscores that automated AI auditing tools must never operate as unverified black boxes; comprehensive OCR preprocessing and data hygiene controls are imperative.</w:t>
       </w:r>
     </w:p>
     <w:p>
@@ -30449,7 +30449,7 @@
           <w:color w:val="000000"/>
           <w:sz w:val="24"/>
         </w:rPr>
-        <w:t>This investigation has successfully replicated, validated, and extended the pioneering framework of Kang and Kim (2022) within the Vietnamese equity market. By mining 95,804 sentences across 42 reports from seven premier corporations over 2020–2025, we provide definitive empirical evidence regarding SDG alignment, narrative sentiment bias, and market decoupling (pooled r = -0.046, p = 0.791). Crucially, the discovery of OCR digitization artifacts provides a profound methodological warning for the international computational accounting community.</w:t>
+        <w:t>This investigation has successfully replicated, validated, and extended the pioneering framework of Kang and Kim (2022) within the Vietnamese equity market. By mining 96,461 sentences across 42 reports from seven premier corporations over 2020–2025 (integrating dedicated OCR recovery for scanned documentation), we provide definitive empirical evidence regarding SDG alignment, narrative sentiment bias, and complete market decoupling (pooled r = -0.043, p = 0.806). Crucially, the empirical demonstration of OCR data remediation provides a profound methodological blueprint for the international computational accounting and ESG research community.</w:t>
       </w:r>
     </w:p>
     <w:p>

</xml_diff>

<commit_message>
chore: update paper title and authors (Le Dan Son, Duong Thi Hoan), remove affiliations
</commit_message>
<xml_diff>
--- a/papers/paper_sdg_vietnam_en.docx
+++ b/papers/paper_sdg_vietnam_en.docx
@@ -4,7 +4,7 @@
   <w:body>
     <w:p>
       <w:pPr>
-        <w:spacing w:before="280" w:after="160"/>
+        <w:spacing w:before="280" w:after="240"/>
         <w:jc w:val="center"/>
       </w:pPr>
       <w:r>
@@ -14,12 +14,12 @@
           <w:color w:val="000000"/>
           <w:sz w:val="30"/>
         </w:rPr>
-        <w:t>ANALYZING AND VISUALIZING TEXT INFORMATION IN CORPORATE SUSTAINABILITY REPORTS USING NATURAL LANGUAGE PROCESSING METHODS: EMPIRICAL EVIDENCE FROM VIETNAM</w:t>
+        <w:t>MULTILINGUAL NLP FOR SDG AND SENTIMENT ANALYSIS OF CORPORATE SUSTAINABILITY REPORTS: EVIDENCE FROM VIETNAMESE ENTERPRISES</w:t>
       </w:r>
     </w:p>
     <w:p>
       <w:pPr>
-        <w:spacing w:after="40"/>
+        <w:spacing w:after="360"/>
         <w:jc w:val="center"/>
       </w:pPr>
       <w:r>
@@ -27,25 +27,9 @@
           <w:rFonts w:ascii="Times New Roman" w:hAnsi="Times New Roman"/>
           <w:b/>
           <w:color w:val="000000"/>
-          <w:sz w:val="23"/>
+          <w:sz w:val="24"/>
         </w:rPr>
-        <w:t>Artificial Intelligence and Sustainable Finance Research Group</w:t>
-      </w:r>
-    </w:p>
-    <w:p>
-      <w:pPr>
-        <w:spacing w:after="280"/>
-        <w:jc w:val="center"/>
-      </w:pPr>
-      <w:r>
-        <w:rPr>
-          <w:rFonts w:ascii="Times New Roman" w:hAnsi="Times New Roman"/>
-          <w:color w:val="000000"/>
-          <w:sz w:val="21"/>
-        </w:rPr>
-        <w:t>Department of Finance and Banking, University of Economics</w:t>
-        <w:br/>
-        <w:t>Correspondence: research.esg@vietnam-analytics.edu.vn</w:t>
+        <w:t>Le Dan Son, Duong Thi Hoan</w:t>
       </w:r>
     </w:p>
     <w:p>
@@ -19452,7 +19436,7 @@
       <w:r>
         <w:drawing>
           <wp:inline xmlns:a="http://schemas.openxmlformats.org/drawingml/2006/main" xmlns:pic="http://schemas.openxmlformats.org/drawingml/2006/picture">
-            <wp:extent cx="5303520" cy="12425390"/>
+            <wp:extent cx="5303520" cy="12431332"/>
             <wp:docPr id="3" name="Picture 3"/>
             <wp:cNvGraphicFramePr>
               <a:graphicFrameLocks noChangeAspect="1"/>
@@ -19473,7 +19457,7 @@
                   <pic:spPr>
                     <a:xfrm>
                       <a:off x="0" y="0"/>
-                      <a:ext cx="5303520" cy="12425390"/>
+                      <a:ext cx="5303520" cy="12431332"/>
                     </a:xfrm>
                     <a:prstGeom prst="rect"/>
                   </pic:spPr>
@@ -19693,7 +19677,7 @@
       <w:r>
         <w:drawing>
           <wp:inline xmlns:a="http://schemas.openxmlformats.org/drawingml/2006/main" xmlns:pic="http://schemas.openxmlformats.org/drawingml/2006/picture">
-            <wp:extent cx="5120640" cy="2872640"/>
+            <wp:extent cx="5120640" cy="2777356"/>
             <wp:docPr id="6" name="Picture 6"/>
             <wp:cNvGraphicFramePr>
               <a:graphicFrameLocks noChangeAspect="1"/>
@@ -19714,7 +19698,7 @@
                   <pic:spPr>
                     <a:xfrm>
                       <a:off x="0" y="0"/>
-                      <a:ext cx="5120640" cy="2872640"/>
+                      <a:ext cx="5120640" cy="2777356"/>
                     </a:xfrm>
                     <a:prstGeom prst="rect"/>
                   </pic:spPr>

</xml_diff>

<commit_message>
feat: add reference library files (.enw, .ris) and enrich industry-specific ESG analysis
</commit_message>
<xml_diff>
--- a/papers/paper_sdg_vietnam_en.docx
+++ b/papers/paper_sdg_vietnam_en.docx
@@ -77,7 +77,7 @@
           <w:color w:val="000000"/>
           <w:sz w:val="24"/>
         </w:rPr>
-        <w:t>, this study conducts an automated textual analysis of 42 standalone sustainability and integrated reports published by seven prominent Vietnamese listed corporations (Bao Viet Holdings, The PAN Group, Petrolimex, Phu Nhuan Jewelry, SSI Securities, Vicostone, and Vinamilk) spanning a balanced six-year horizon (2020–2025), encompassing 96,461 digitally extracted sentences. By coupling domain-adapted multilingual Transformer architectures (vietnamese-sbert for Vietnamese and all-MiniLM-L6-v2 for English) with PhoBERT sentiment classification, we quantify corporate semantic alignment with the 17 UN Sustainable Development Goals (SDGs), aggregate alignments into six core human-needs categories (Life, Economic, Equity, Social, Resources, Environments), and evaluate contextual narrative tone (Positive, Neutral, Negative). Empirical findings demonstrate that Kang and Kim's (2022) methodology generalizes robustly to Vietnamese corporate disclosures and emerging market reporting environments, uncovering key empirical characteristics: (1) Disclosures exhibit an overwhelming thematic concentration on Economic development (SDGs 8, 9) and Global Partnerships (SDG 17), alongside systemic under-representation in Equity disclosures (SDGs 4, 5, 10); (2) Disclosures display pronounced structural optimism bias (53.87% positive, 32.87% neutral, and merely 13.26% negative sentences; mean Pos/Neg ratio exceeding 4.0), reflecting achievement-oriented impression management; and (3) Textual reporting volume and SDG thematic coverage have steadily expanded across the 2020–2025 observation period following the enforcement of Circular 96/2020/TT-BTC. This study establishes a practical empirical use case demonstrating the viability of computational NLP for non-financial audit in Vietnam.</w:t>
+        <w:t>, this study conducts an automated textual analysis of 42 standalone sustainability and integrated reports published by seven prominent Vietnamese listed corporations (Bao Viet Holdings, The PAN Group, Petrolimex, Phu Nhuan Jewelry, SSI Securities, Vicostone, and Vinamilk) spanning a balanced six-year horizon (2020–2025), encompassing 96,461 digitally extracted sentences. By coupling domain-adapted multilingual Transformer architectures (vietnamese-sbert for Vietnamese and all-MiniLM-L6-v2 for English) with PhoBERT sentiment classification, we quantify corporate semantic alignment with the 17 UN Sustainable Development Goals (SDGs), aggregate alignments into six core human-needs categories (Life, Economic, Equity, Social, Resources, Environments), and evaluate contextual narrative tone (Positive, Neutral, Negative). Empirical findings demonstrate that Kang and Kim's (2022) methodology generalizes robustly to Vietnamese corporate disclosures and emerging market reporting environments, uncovering key empirical characteristics: (1) Corporate SDG scores closely mirror sectoral business models: manufacturing and dairy leaders like Vicostone and Vinamilk achieve superior scores in Resources and Environments, agrifood giant PAN aligns prominently with Life, financial institutions like Bao Viet and SSI dominate in Economic and Social/Partnership pillars, while fashion retail leader PNJ emphasizes DE&amp;I gender equity; (2) National disclosure tendencies reveal a pronounced dichotomy: enterprises extensively discuss economic growth (SDG 8), infrastructure innovation (SDG 9), philanthropic CSR (SDGs 1, 17), and internal eco-efficiency savings (SDGs 6, 7, 12), while systematically omitting substantive disclosures on terrestrial and marine biodiversity (SDGs 14, 15), executive gender representation and income disparity (SDGs 5, 10), Scope 3 value-chain greenhouse gas emissions, and negative operational violations; (3) Disclosures display pronounced structural optimism bias (53.87% positive, 32.87% neutral, and only 13.26% negative sentences; mean Pos/Neg ratio of 4.06), reflecting achievement-oriented impression management; and (4) Textual reporting volume and SDG thematic coverage have steadily expanded over the 2020–2025 observation window following the enactment of Circular 96/2020/TT-BTC. This study establishes a practical empirical use case demonstrating the viability of computational NLP for non-financial auditing in Vietnam.</w:t>
       </w:r>
     </w:p>
     <w:p>
@@ -94,7 +94,7 @@
           <w:color w:val="000000"/>
           <w:sz w:val="24"/>
         </w:rPr>
-        <w:t>Keywords: Corporate sustainability reports; Sustainable Development Goals (SDGs); Natural language processing (NLP); Sentence-BERT; PhoBERT; Sentiment analysis; Impression management; Vietnamese listed enterprises.</w:t>
+        <w:t>Keywords: Corporate sustainability reports; Sustainable Development Goals (SDGs); Natural language processing (NLP); Sentence-BERT; PhoBERT; Sentiment analysis; Impression management; Industry-specific disclosures; Vietnamese listed enterprises.</w:t>
       </w:r>
     </w:p>
     <w:p>
@@ -10347,7 +10347,7 @@
           <w:color w:val="000000"/>
           <w:sz w:val="25"/>
         </w:rPr>
-        <w:t>4.2 Six-Category SDG Heatmap Matrix</w:t>
+        <w:t>4.2 Six-Category SDG Heatmap Matrix and Sector-Specific Profiles</w:t>
       </w:r>
     </w:p>
     <w:p>
@@ -19243,7 +19243,7 @@
           <w:color w:val="000000"/>
           <w:sz w:val="24"/>
         </w:rPr>
-        <w:t>As reported in Table 4, Economic scores consistently rank highest across all corporate disclosures, ranging from 43.19 to 51.90 points. This reflects the core pragmatic focus of Vietnamese enterprises, where economic growth, employment generation (SDG 8), and infrastructure innovation (SDG 9) form the foundation of corporate communications. Conversely, the Equity category (SDGs 4, 5, 10: quality education, gender equality, and reduced inequalities) records the lowest scores (ranging between 38.36 and 44.94 points). A structural gap of 6 to 8 points between Economic and Equity persists across all corporations, documenting a systemic priority divergence in corporate sustainability disclosures.</w:t>
+        <w:t>Delving into granular firm-level and sectoral nuances from Table 4, the six-category scores faithfully reflect the interplay between core business models and sustainability strategic priorities:\n(1) Vinamilk (VNM - Dairy Farming and Nutritional Beverages): With 15 industrial dairy farms and 13 packaging facilities nationwide, Vinamilk faces substantial direct exposure to agricultural biological waste, water conservation, and agricultural greenhouse gas emissions. Consequently, Vinamilk achieves the fastest score acceleration in Resources (climbing from 42.36 to 47.33 points) and Environments (leaping from 41.23 to 47.29 points, a sample-wide peak gain of +6.06 points). This stems directly from Vinamilk's pioneering Net-Zero 2050 commitments, international PAS 2060 carbon neutrality certification of its Nghe An factory and dairy farm, and the rollout of Green Farm eco-facilities featuring 100% circular water recycling and rooftop solar arrays.\n(2) Vicostone (VCS - Engineered Quartz Stone Surfaces and Advanced Manufacturing): As an engineered stone manufacturer exporting to over 50 countries, VCS's core operations are heavily energy- and mineral-intensive. Reflecting this industrial reality, VCS consistently secures the highest Economic (peaking at 51.90 points in 2025) and Resources scores (50.03 points). Its disclosures feature exhaustive coverage of Breton (Italy) vacuum vibration compaction technology, 100% recycling of stone slurry waste into manufacturing filler, zero-discharge water recycling, and stringent volatile organic compound (VOC) controls to maintain Greenguard Gold air quality certifications.\n(3) The PAN Group (PAN - High-Tech Agriculture and Sustainable Aquaculture): Spanning crop breeding (Vinaseed), packaged staples, and export aquaculture (Fimex VN), PAN exhibits standout alignment in Life (SDG 2 Zero Hunger; SDG 3 Good Health) and Resources (SDG 12 Responsible Consumption), maintaining stable scores between 45 and 47 points. PAN's disclosures emphasize low-emission rice cultivation, biosecure shrimp farming free of prophylactic antibiotics, and farm-to-fork value-chain traceability.\n(4) Petrolimex (PLX - Petroleum Energy Distribution): As the dominant state-owned downstream petroleum distributor commanding over 50% market share, Petrolimex faces acute decarbonization pressures. Its scores are prominently weighted toward Resources (SDG 7 Clean Energy) and Environments (SDG 13 Climate Action), reaching 46.86 and 46.41 points in 2025. Petrolimex focuses heavily on distributing Euro 5 low-sulfur diesel (DO 0.001S-V), expanding E5 RON 92 biofuel retail infrastructure, installing rooftop solar at service stations, and executing enterprise-wide ISO 14064-1 greenhouse gas inventories.\n(5) Bao Viet Holdings (BVH) and SSI Securities (Finance, Insurance &amp; Capital Markets): Operating as non-polluting financial intermediaries without heavy smokestack manufacturing facilities, direct environmental emissions are minor. Instead, BVH and SSI concentrate heavily on Economic pillars (SDGs 8, 9 &gt; 50 points) and Social/Governance pillars (SDG 16 Institutional Transparency; SDG 17 Sustainable Finance Partnerships &gt; 49 points). Both institutions position themselves as catalysts for responsible investment: BVH expands micro-insurance protection for underprivileged rural demographics, while SSI pioneers green credit appraisal and advisory services for corporate Green Bond issuance.\n(6) Phu Nhuan Jewelry (PNJ - Luxury Jewelry Retail and Craftsmanship): Possessing an extensive retail footprint staffed predominantly by women (&gt;60%) alongside artisanal goldsmiths, PNJ demonstrates superior performance in Social and Life pillars. Crucially, its explicit strategic focus on Diversity, Equity, and Inclusion (DE&amp;I) and female career advancement (SDG 5) is far more prominent than in heavy manufacturing sectors.</w:t>
       </w:r>
     </w:p>
     <w:p>
@@ -26282,7 +26282,7 @@
           <w:color w:val="000000"/>
           <w:sz w:val="25"/>
         </w:rPr>
-        <w:t>5.1 Salient Characteristics of Vietnamese Corporate Sustainability Reporting</w:t>
+        <w:t>5.1 Sectoral Tendencies in Vietnamese Disclosures: What Corporations Disclose Extensively vs. What They Omit</w:t>
       </w:r>
     </w:p>
     <w:p>
@@ -26299,7 +26299,7 @@
           <w:color w:val="000000"/>
           <w:sz w:val="24"/>
         </w:rPr>
-        <w:t>Deploying the computational NLP pipeline across 42 reports isolates three defining empirical characteristics in Vietnamese sustainability reporting: (1) Economic primacy and partnership emphasis: Economic (SDGs 8, 9) and Partnership (SDG 17) disclosures receive paramount attention, reflecting the priorities of an emerging market where capital accumulation, infrastructure development, and employment remain core stakeholder expectations; (2) Persistent Equity under-disclosure: Equity goals (SDGs 4, 5, 10) consistently record the lowest alignment scores, indicating that workplace diversity, income inequality, and vulnerable group integration remain underdeveloped within corporate ESG agendas; (3) Achievement-oriented impression management: An overwhelming proportion of positive statements (nearly 54%) combined with high Pos/Neg ratios (4–8) confirms that sustainability reports in Vietnam primarily function as brand-building communication instruments rather than balanced risk-accounting documents.</w:t>
+        <w:t>Computational text analytics on 96,461 sentences reveals a stark empirical contrast in Vietnamese sustainability reporting culture. Disclosures exhibit a systematic divergence between heavily promoted public relations themes and neglected or sensitive dimensions:\n\nA. THEMES CORPORATIONS DISCLOSE EXTENSIVELY:\n(1) Economic Expansion, Employment, and Fiscal Contributions (SDGs 8, 9): Corporations dedicate their largest narrative volume to revenue growth, corporate income tax payments, operational scaling, automated machinery acquisitions, and employee remuneration/welfare packages. These traditional metrics align directly with short-term shareholder expectations and commercial viability;\n(2) Philanthropic Social Welfare and Community Charity (SDGs 1, 17): Disclosures devote extensive multi-page photographic spreads to rural bridge construction, charity housing donations, poverty scholarships, and typhoon relief. Corporate social responsibility (CSR) in Vietnam remains heavily anchored in traditional philanthropy rather than integrated creating-shared-value (CSV) frameworks;\n(3) Internal Eco-Efficiency and Operational Cost Reductions (SDGs 6, 7, 12): Enterprises eagerly report statistics on LED office lighting conversions, paperless workflows, energy-efficient HVAC upgrades, and recycled equipment cooling water. These environmental initiatives deliver dual benefits: they build external green legitimacy while simultaneously lowering overhead operating expenditures.\n\nB. THEMES CORPORATIONS CONVERSELY OMIT OR MINIMIZE:\n(1) Terrestrial and Marine Biodiversity Conservation (SDG 14 Below Water, SDG 15 On Land): This represents the most profound disclosure blind spot across all 42 reports. Enterprises almost universally lack quantified metrics assessing the impact of their manufacturing or supply chains on forest ecosystems, wetlands, or marine fisheries, relying instead on superficial boilerplate slogans regarding green landscaping;\n(2) Substantive Executive Gender Equality and Pay Disparity (SDGs 5, 10): While firms readily report aggregate female employee percentages (often elevated due to shop-floor labor), they rarely disclose the proportion of women holding seats on Boards of Directors or Executive Management. Crucially, enterprises strictly conceal CEO-to-worker compensation ratios and gender-differentiated wage gaps across equivalent managerial strata;\n(3) Scope 3 Value-Chain Greenhouse Gas Emissions: Although direct factory emissions (Scope 1) and purchased electricity (Scope 2) are increasingly quantified, indirect emissions embedded across upstream suppliers and downstream product lifecycles (Scope 3—typically representing 70–80% of actual corporate carbon footprints) remain unaddressed due to technical deficiencies and decentralized supply chains;\n(4) Negative Operational Violations, Labor Disputes, and Penalties (SDG 16): Reports are comprehensively sanitized of severe workplace accidents, consumer product quality grievances, labor disputes, or administrative fines levied by environmental and tax authorities. This selective omission transforms sustainability reports into one-sided promotional brochures rather than robust risk-governance instruments.</w:t>
       </w:r>
     </w:p>
     <w:p>
@@ -26427,7 +26427,7 @@
           <w:color w:val="000000"/>
           <w:sz w:val="24"/>
         </w:rPr>
-        <w:t>This study has successfully conducted an empirical replication and contextual adaptation of Kang and Kim (2022)'s NLP framework within the Vietnamese equity market. Analyzing 96,461 sentences across 42 sustainability reports published by seven prominent corporations from 2020 to 2025 demonstrates that SBERT and PhoBERT effectively quantify corporate SDG engagement and narrative sentiment in a low-resource linguistic setting. The empirical findings illuminate the primary characteristics of Vietnamese sustainability reporting—namely economic focus, equity disclosure gaps, and pervasive structural optimism. These insights underscore the substantial potential of computational AI techniques for automating non-financial corporate auditing in emerging Southeast Asian economies.</w:t>
+        <w:t>This study has successfully conducted an empirical replication and contextual adaptation of Kang and Kim (2022)'s NLP framework within the Vietnamese equity market. Analyzing 96,461 sentences across 42 sustainability reports published by seven prominent corporations from 2020 to 2025 demonstrates that SBERT and PhoBERT effectively quantify corporate SDG engagement and narrative sentiment in a low-resource linguistic setting. The empirical findings illuminate the primary characteristics of Vietnamese sustainability reporting—namely intimate alignment with core sectoral business models, profound dichotomies between heavily disclosed economic/philanthropic themes and omitted biodiversity/governance metrics, and pervasive structural optimism. These insights underscore the substantial potential of computational AI techniques for automating non-financial corporate auditing in emerging Southeast Asian economies.</w:t>
       </w:r>
     </w:p>
     <w:p>

</xml_diff>